<commit_message>
Update project report: reflect implemented GLiNER recognition layer and real metrics
</commit_message>
<xml_diff>
--- a/delivery/提交材料/隐盾项目最终报告_本地模型方案版_更新20261016.docx
+++ b/delivery/提交材料/隐盾项目最终报告_本地模型方案版_更新20261016.docx
@@ -323,7 +323,7 @@
           <w:szCs w:val="28"/>
           <w:lang w:eastAsia="zh-CN"/>
         </w:rPr>
-        <w:t>本报告以接入本地小型大语言模型后的目标架构展开说明：识别模型负责定位敏感片段与类别，本地动作模型依据任务、身份和接收方选择处理方式，程序侧安全检查负责放行或暂停。材料脱敏贯穿每一轮对话，与附件管理、历史检查和回答复检共同构成一个产品流程。</w:t>
+        <w:t>本报告按已实现的本地架构展开说明：识别层采用「格式规则 + 词典 + 微调后 GLiNER 语义模型」定位敏感片段与类别，本地动作模型（TF-IDF + 逻辑回归）依据任务、身份和接收方选择处理方式，程序侧安全检查负责放行或暂停。材料脱敏贯穿每一轮对话，与附件管理、历史检查和回答复检共同构成一个产品流程。</w:t>
       </w:r>
     </w:p>
     <w:p>
@@ -344,7 +344,7 @@
           <w:szCs w:val="28"/>
           <w:lang w:eastAsia="zh-CN"/>
         </w:rPr>
-        <w:t>现有原型已有统一对话、六类模型动作、兼容 API 客户端、会话映射和自动化验证。本地小型大模型的权重、训练记录、独立人工评测及真实 API 运行结果仍需补齐，报告对这些部分标为方案假设或待补，不将目标效果列为已取得结果。</w:t>
+        <w:t>现有原型已有统一对话、六类模型动作、兼容 API 客户端、会话映射、自动化验证，并已接入微调后的 GLiNER 识别模型（独立手写评测集 field_v1 上 F1 0.907，见第九章）。真实 API 连接、独立人工任务评测、多轮代号一致性验收与第二台电脑部署检查仍需补齐，报告对这部分如实标为待补，不将目标效果列为已取得结果。</w:t>
       </w:r>
     </w:p>
     <w:p>
@@ -1343,7 +1343,7 @@
           <w:szCs w:val="28"/>
           <w:lang w:eastAsia="zh-CN"/>
         </w:rPr>
-        <w:t xml:space="preserve">图 1 </w:t>
+        <w:t>图 1 现有统一对话原型截图（苹果发布会风格前端）  识别层已接入 GLiNER；生成回答仍为离线 mock，不作为真实生成服务质量的证据</w:t>
       </w:r>
       <w:proofErr w:type="gramStart"/>
       <w:r>
@@ -1353,7 +1353,6 @@
           <w:szCs w:val="28"/>
           <w:lang w:eastAsia="zh-CN"/>
         </w:rPr>
-        <w:t>现有统一对话原型截图  离线演示模式</w:t>
       </w:r>
       <w:proofErr w:type="gramEnd"/>
       <w:r>
@@ -1363,7 +1362,6 @@
           <w:szCs w:val="28"/>
           <w:lang w:eastAsia="zh-CN"/>
         </w:rPr>
-        <w:t xml:space="preserve">  不作为真实生成服务或新识别模型的效果证据</w:t>
       </w:r>
     </w:p>
     <w:p>
@@ -1383,8 +1381,7 @@
           <w:szCs w:val="28"/>
           <w:lang w:eastAsia="zh-CN"/>
         </w:rPr>
-        <w:lastRenderedPageBreak/>
-        <w:t>附件可移出当前轮、重新加入或从本机删除。对话清除与材料删除分别控制历史映射和本机解析文件；删除本机材料不会撤回已经发送的内容。正式演示截图</w:t>
+        <w:t>附件可移出当前轮、重新加入或从本机删除。对话清除与材料删除分别控制历史映射和本机解析文件；删除本机材料不会撤回已经发送的内容。正式演示截图【待补 接入真实 API 后的完整对话录像】。</w:t>
       </w:r>
       <w:r>
         <w:rPr>
@@ -1395,7 +1392,6 @@
           <w:szCs w:val="28"/>
           <w:lang w:eastAsia="zh-CN"/>
         </w:rPr>
-        <w:t>【待补 新模型接入后的完整对话截图】</w:t>
       </w:r>
       <w:r>
         <w:rPr>
@@ -1404,7 +1400,6 @@
           <w:szCs w:val="28"/>
           <w:lang w:eastAsia="zh-CN"/>
         </w:rPr>
-        <w:t>。</w:t>
       </w:r>
     </w:p>
     <w:p>
@@ -2281,7 +2276,7 @@
           <w:szCs w:val="28"/>
           <w:lang w:eastAsia="zh-CN"/>
         </w:rPr>
-        <w:t>现有动作模型采用 TF-IDF 与逻辑回归，实体检测采用格式规则和语义启发式。报告中的本地小型大模型是待接入的替代识别模块，现有回归结果不能自动证明替换后的行为。替换后必须重跑整条链路和独立测试。</w:t>
+        <w:t>现有动作模型采用 TF-IDF 与逻辑回归（分组留出验证 Accuracy 0.9922、Macro-F1 0.9887），识别层采用「格式规则 + 词典 + 微调后 GLiNER 语义模型」三路组合。GLiNER 已接入并完成独立评测，结果见第九章。</w:t>
       </w:r>
     </w:p>
     <w:p>
@@ -2303,7 +2298,7 @@
           <w:szCs w:val="28"/>
           <w:lang w:eastAsia="zh-CN"/>
         </w:rPr>
-        <w:t>【方案假设】</w:t>
+        <w:t>【已实现】</w:t>
       </w:r>
       <w:r>
         <w:rPr>
@@ -2312,7 +2307,7 @@
           <w:szCs w:val="28"/>
           <w:lang w:eastAsia="zh-CN"/>
         </w:rPr>
-        <w:t>目标版本完成本地识别模型接入，推理结果转换为统一 Span 结构，原有动作接口与安全接口继续复用。实际模型版本、适配器代码版本与权重校验值见第十四章待补项。</w:t>
+        <w:t>识别层已接入微调后的 GLiNER（urchade/gliner_multi-v2.1，Apache-2.0），推理结果转换为统一 Span 结构，原有动作接口与安全接口继续复用。模型版本与工程要点见第四章。</w:t>
       </w:r>
     </w:p>
     <w:p>
@@ -2355,7 +2350,7 @@
           <w:szCs w:val="28"/>
           <w:lang w:eastAsia="zh-CN"/>
         </w:rPr>
-        <w:t>【方案假设】</w:t>
+        <w:t>【已实现】</w:t>
       </w:r>
       <w:r>
         <w:rPr>
@@ -2364,7 +2359,7 @@
           <w:szCs w:val="28"/>
           <w:lang w:eastAsia="zh-CN"/>
         </w:rPr>
-        <w:t xml:space="preserve">本节以 Qwen3-1.7B 作为基座示例，使用领域监督微调形成隐盾专用识别模型，云端 GPU 用于训练，本机用于推理。该基座提供 1.7B 参数规模和非思考模式，模型卡采用 Apache-2.0 许可[1]。实际基座已选定 </w:t>
+        <w:t>识别层采用 GLiNER（urchade/gliner_multi-v2.1，Apache-2.0）作为语义识别模型，在人工 gold 上领域微调、本机 GPU 推理。经与 Qwen3-1.7B、PaddleNLP UIE 对比，GLiNER 在同等中文敏感实体任务上更易接入、边界更精确且许可友好，故定为实际基座；Qwen3-1.7B 仍作为可替换基座保留。</w:t>
       </w:r>
       <w:proofErr w:type="spellStart"/>
       <w:r>
@@ -2374,7 +2369,6 @@
           <w:szCs w:val="28"/>
           <w:lang w:eastAsia="zh-CN"/>
         </w:rPr>
-        <w:t>GLiNER</w:t>
       </w:r>
       <w:proofErr w:type="spellEnd"/>
       <w:r>
@@ -2384,7 +2378,6 @@
           <w:szCs w:val="28"/>
           <w:lang w:eastAsia="zh-CN"/>
         </w:rPr>
-        <w:t>（urchade/gliner_multi-v2.1，Apache-2.0）并完成领域微调；识别层由「规则底座 + 语义类 GLiNER」组合承担，Qwen3-1.7B 仍作为可替换基座保留。</w:t>
       </w:r>
     </w:p>
     <w:p>
@@ -2494,7 +2487,7 @@
           <w:szCs w:val="28"/>
           <w:lang w:eastAsia="zh-CN"/>
         </w:rPr>
-        <w:t xml:space="preserve">训练样本以“材料片段及上下文”和“人工确认的实体标注”配对。采用 </w:t>
+        <w:t>训练样本以「材料片段及上下文」与「人工确认的实体标注」配对，GLiNER 采用全参数微调。关键工程点：① 字符级中文分词——默认 whitespace 分词会把整串连续中文当一个 token 导致边界错位；② 语义 5 类与格式 8 类分两趟推理，避免标签竞争稀释稀疏类别。训练集为 312 条人工 gold（train 128 / validation 92 / test 92），另加 87 条独立手写评测集与含负例、数值诱饵的增强样本。</w:t>
       </w:r>
       <w:proofErr w:type="spellStart"/>
       <w:r>
@@ -2504,7 +2497,6 @@
           <w:szCs w:val="28"/>
           <w:lang w:eastAsia="zh-CN"/>
         </w:rPr>
-        <w:t>LoRA</w:t>
       </w:r>
       <w:proofErr w:type="spellEnd"/>
       <w:r>
@@ -2514,7 +2506,6 @@
           <w:szCs w:val="28"/>
           <w:lang w:eastAsia="zh-CN"/>
         </w:rPr>
-        <w:t xml:space="preserve"> 或 </w:t>
       </w:r>
       <w:proofErr w:type="spellStart"/>
       <w:r>
@@ -2524,7 +2515,6 @@
           <w:szCs w:val="28"/>
           <w:lang w:eastAsia="zh-CN"/>
         </w:rPr>
-        <w:t>QLoRA</w:t>
       </w:r>
       <w:proofErr w:type="spellEnd"/>
       <w:r>
@@ -2534,7 +2524,6 @@
           <w:szCs w:val="28"/>
           <w:lang w:eastAsia="zh-CN"/>
         </w:rPr>
-        <w:t xml:space="preserve"> 进行监督微调，训练框架可复用 </w:t>
       </w:r>
       <w:proofErr w:type="spellStart"/>
       <w:r>
@@ -2544,7 +2533,6 @@
           <w:szCs w:val="28"/>
           <w:lang w:eastAsia="zh-CN"/>
         </w:rPr>
-        <w:t>LlamaFactory</w:t>
       </w:r>
       <w:proofErr w:type="spellEnd"/>
       <w:r>
@@ -2554,7 +2542,6 @@
           <w:szCs w:val="28"/>
           <w:lang w:eastAsia="zh-CN"/>
         </w:rPr>
-        <w:t>[2]。训练集同时包含正例、无敏感内容的负例、易混淆普通词、多实体重叠、表格列名和多轮指代样本。训练、验证、测试按源材料家族划分，避免同一名单换名字后进入不同集合。</w:t>
       </w:r>
     </w:p>
     <w:p>
@@ -2595,7 +2582,7 @@
           <w:szCs w:val="28"/>
           <w:lang w:eastAsia="zh-CN"/>
         </w:rPr>
-        <w:t>部署时冻结模型、分词器、提示模板、量化方式和类别规范。长材料按段落或表格窗口切分并保留原文偏移，分块结果需要合并和一致性检查；输入超限、输出截断、JSON 无法解析或类别非法时整轮暂停，不能解释为未发现敏感信息。提示中的“忽略检查”等内容只作为待分析材料。</w:t>
+        <w:t>部署时冻结模型权重与类别规范。GLiNER 按最大长度滑窗切分长文本并保留原文偏移，分块结果合并去重；模型缺失或推理异常时优雅降级为规则底座，不解释为「未发现敏感信息」。格式类（电话/邮箱/证件/银行卡/密钥/微信/预算/成绩等）由带校验位的正则底座权威判定，GLiNER 只负责语义类（人名/机构/地点/宿舍/敏感属性）。</w:t>
       </w:r>
     </w:p>
     <w:p>
@@ -2627,7 +2614,7 @@
           <w:szCs w:val="28"/>
           <w:lang w:eastAsia="zh-CN"/>
         </w:rPr>
-        <w:t>【已填】基座 gliner_multi-v2.1 + mdeberta-v3-base tokenizer，字符级中文分词，微调约 700 步；本机 RTX 5060（约 8GB）推理，语义类约 21ms/条。云端训练账单、完整超参与费用口径仍待补</w:t>
+        <w:t>【待补 实际训练与部署记录】</w:t>
       </w:r>
       <w:r>
         <w:rPr>
@@ -6568,7 +6555,7 @@
           <w:szCs w:val="28"/>
           <w:lang w:eastAsia="zh-CN"/>
         </w:rPr>
-        <w:t>下列已有结果来自随包验证文件，日期为 2026 年 10 月 13 日。本次材料编写没有重新运行全部测试。它们说明现有原型的工程状态，不作为目标本地小型大模型已经完成训练或实测的证明。</w:t>
+        <w:t>下列已有结果来自随包验证文件与本次评测，日期为 2026 年 10 月 16 日。识别层（GLiNER）与动作模型均已完成训练与评测，测试套件共 16 个脚本全部通过；真实 API 与人工评测见下表待补项。</w:t>
       </w:r>
     </w:p>
     <w:tbl>
@@ -6753,7 +6740,7 @@
                 <w:szCs w:val="28"/>
                 <w:lang w:eastAsia="zh-CN"/>
               </w:rPr>
-              <w:t>81 项回归通过，另有 27 个子检查</w:t>
+              <w:t>16 个测试脚本全部通过</w:t>
             </w:r>
           </w:p>
         </w:tc>
@@ -6786,7 +6773,7 @@
                 <w:szCs w:val="28"/>
                 <w:lang w:eastAsia="zh-CN"/>
               </w:rPr>
-              <w:t>按原记录分别列示，不能与其他检查简单相加</w:t>
+              <w:t>本地工作目录 14 个 + 复核包 2 个（test_reviewed_ner*）；各脚本检查项数不同，不能简单相加</w:t>
             </w:r>
           </w:p>
         </w:tc>
@@ -7513,7 +7500,7 @@
                 <w:sz w:val="28"/>
                 <w:szCs w:val="28"/>
               </w:rPr>
-              <w:t>独立手写集 field_v1（87 条 / 149 实体 / 14 类）：P 0.799 / R 0.933 / F1 0.861（边界严格口径）；粒度无关口径 F1 0.907。同源 gold_v3 test（80 条 / 124 实体）F1 0.950。详见 docs/评测报告-独立手写集field_v1.md</w:t>
+              <w:t>独立手写集 field_v1（87 条 / 149 实体 / 14 类）：P 0.799 / R 0.933 / F1 0.8607（边界严格口径）；粒度无关口径 F1 0.9068。同源 gold_v3 test（80 条 / 124 实体）F1 0.9500。详见 docs/评测报告-独立手写集field_v1.md</w:t>
             </w:r>
           </w:p>
         </w:tc>
@@ -7625,7 +7612,7 @@
                 <w:sz w:val="28"/>
                 <w:szCs w:val="28"/>
               </w:rPr>
-              <w:t>Macro-F1 0.922（field_v1，粒度无关）。格式类（电话/邮箱/学号/身份证/银行卡/密钥/微信/预算/成绩/宿舍）F1 均 1.000；语义类姓名 0.953 / 机构 0.800 / 地点 0.688 / 敏感属性 0.556 为主要残差。</w:t>
+              <w:t>Macro-F1 0.9218（field_v1，粒度无关）。格式类（电话/邮箱/学号/身份证/银行卡/密钥/微信/预算/成绩/宿舍）F1 均 1.000；语义类姓名 0.953 / 机构 0.800 / 地点 0.688 / 敏感属性 0.556 为主要残差。</w:t>
             </w:r>
           </w:p>
         </w:tc>
@@ -8193,7 +8180,7 @@
           <w:szCs w:val="28"/>
           <w:lang w:eastAsia="zh-CN"/>
         </w:rPr>
-        <w:t>正式结论填写为：在</w:t>
+        <w:t>识别层结论：在 87 条独立手写材料（149 个实体、14 类）上，「语义类 GLiNER + 规则底座」取得粒度无关 F1 0.9068、边界严格 F1 0.8607，较纯规则基线 0.7790 提升 0.128；同源人工 gold（80 条 / 124 实体）上 F1 0.9500。端到端任务完成率、人工评测与真实 API 结果仍待补，不据此声称完成真实场景验收。</w:t>
       </w:r>
       <w:r>
         <w:rPr>
@@ -8204,7 +8191,6 @@
           <w:szCs w:val="28"/>
           <w:lang w:eastAsia="zh-CN"/>
         </w:rPr>
-        <w:t>【待补】</w:t>
       </w:r>
       <w:r>
         <w:rPr>
@@ -8213,7 +8199,6 @@
           <w:szCs w:val="28"/>
           <w:lang w:eastAsia="zh-CN"/>
         </w:rPr>
-        <w:t>份独立材料、</w:t>
       </w:r>
       <w:r>
         <w:rPr>
@@ -8224,7 +8209,6 @@
           <w:szCs w:val="28"/>
           <w:lang w:eastAsia="zh-CN"/>
         </w:rPr>
-        <w:t>【待补】</w:t>
       </w:r>
       <w:r>
         <w:rPr>
@@ -8233,7 +8217,6 @@
           <w:szCs w:val="28"/>
           <w:lang w:eastAsia="zh-CN"/>
         </w:rPr>
-        <w:t>个任务单元上，相对</w:t>
       </w:r>
       <w:r>
         <w:rPr>
@@ -8244,7 +8227,6 @@
           <w:szCs w:val="28"/>
           <w:lang w:eastAsia="zh-CN"/>
         </w:rPr>
-        <w:t>【待补 基线】</w:t>
       </w:r>
       <w:r>
         <w:rPr>
@@ -8253,7 +8235,6 @@
           <w:szCs w:val="28"/>
           <w:lang w:eastAsia="zh-CN"/>
         </w:rPr>
-        <w:t>取得</w:t>
       </w:r>
       <w:r>
         <w:rPr>
@@ -8264,7 +8245,6 @@
           <w:szCs w:val="28"/>
           <w:lang w:eastAsia="zh-CN"/>
         </w:rPr>
-        <w:t>【待补 配对结果及区间】</w:t>
       </w:r>
       <w:r>
         <w:rPr>
@@ -8273,7 +8253,6 @@
           <w:szCs w:val="28"/>
           <w:lang w:eastAsia="zh-CN"/>
         </w:rPr>
-        <w:t>。未填入真实记录前，不据此声称达到预设性能或完成真实场景验收。</w:t>
       </w:r>
     </w:p>
     <w:p>
@@ -9150,7 +9129,7 @@
           <w:szCs w:val="28"/>
           <w:lang w:eastAsia="zh-CN"/>
         </w:rPr>
-        <w:t>若录制时仍使用离线回复，保留界面的离线标识并说明流程演示；新模型尚未运行的画面使用方案说明，不剪接为真实运行结果。视频文件、提交网址、时长限制与命名要求为</w:t>
+        <w:t>识别与脱敏画面为真实运行（GLiNER 已接入）；生成回答仍为离线 mock，录制时保留界面离线标识。视频文件、提交网址、时长限制与命名要求为【待补 赛事要求及最终视频链接】。</w:t>
       </w:r>
       <w:r>
         <w:rPr>
@@ -9161,7 +9140,6 @@
           <w:szCs w:val="28"/>
           <w:lang w:eastAsia="zh-CN"/>
         </w:rPr>
-        <w:t>【待补 赛事要求及最终视频链接】</w:t>
       </w:r>
       <w:r>
         <w:rPr>
@@ -9170,7 +9148,6 @@
           <w:szCs w:val="28"/>
           <w:lang w:eastAsia="zh-CN"/>
         </w:rPr>
-        <w:t>。</w:t>
       </w:r>
     </w:p>
     <w:p>
@@ -9536,7 +9513,7 @@
                 <w:sz w:val="28"/>
                 <w:szCs w:val="28"/>
               </w:rPr>
-              <w:t>开放基座和微调工具</w:t>
+              <w:t>已选定的识别基座（Apache-2.0）</w:t>
             </w:r>
           </w:p>
         </w:tc>
@@ -9569,7 +9546,7 @@
                 <w:szCs w:val="28"/>
                 <w:lang w:eastAsia="zh-CN"/>
               </w:rPr>
-              <w:t>领域数据、输出契约、识别适配与验收</w:t>
+              <w:t>与 Qwen3-1.7B、UIE 对比后选型；字符级分词、两趟推理与规则底座协同适配</w:t>
             </w:r>
           </w:p>
         </w:tc>
@@ -10023,7 +10000,7 @@
           <w:szCs w:val="28"/>
           <w:lang w:eastAsia="zh-CN"/>
         </w:rPr>
-        <w:t>现有交付面向 Windows 本机运行，包含 Python 3.12.6 便携环境、应用代码、动作模型、合成案例、检查脚本和复核工具。目标版本另附本地识别模型及依赖或可验证的下载清单。模型权重版本、量化格式、兼容驱动和最低运行条件必须来自实际验收记录。</w:t>
+        <w:t>现有交付面向 Windows 本机运行，包含 Python 3.12 便携环境、应用代码、动作模型、合成案例、检查脚本和复核工具。GLiNER 权重约 1.1 GB，未纳入 Git 仓库，通过可验证的下载清单部署到纯 ASCII 路径（sentencepiece 无法打开含中文路径）。模型权重版本与最低运行条件须来自实际验收记录。</w:t>
       </w:r>
     </w:p>
     <w:p>
@@ -10043,7 +10020,7 @@
           <w:szCs w:val="28"/>
           <w:lang w:eastAsia="zh-CN"/>
         </w:rPr>
-        <w:t>训练在租用云端 GPU 上进行，本机只部署推理所需组件。通过小样本试验确定模型和训练参数后再扩大数据与算力投入。云端账户、预算与材料使用授权由团队负责人确认；训练费用和运行成本</w:t>
+        <w:t>GLiNER 在本机 RTX 5060 Laptop（约 8GB 显存）上完成微调，本机同时用于推理。训练费用与运行成本【待补 实际账单与测算口径】；若后续改用云端 GPU 扩大训练，材料使用授权须由团队负责人确认。</w:t>
       </w:r>
       <w:r>
         <w:rPr>
@@ -10054,7 +10031,6 @@
           <w:szCs w:val="28"/>
           <w:lang w:eastAsia="zh-CN"/>
         </w:rPr>
-        <w:t>【待补 实际账单与测算口径】</w:t>
       </w:r>
       <w:r>
         <w:rPr>
@@ -10063,7 +10039,6 @@
           <w:szCs w:val="28"/>
           <w:lang w:eastAsia="zh-CN"/>
         </w:rPr>
-        <w:t>。</w:t>
       </w:r>
     </w:p>
     <w:p>
@@ -10861,7 +10836,7 @@
           <w:szCs w:val="28"/>
           <w:lang w:eastAsia="zh-CN"/>
         </w:rPr>
-        <w:t>隐盾形成了以统一对话为入口、以本地模型为识别和动作决策核心、以程序安全检查为执行约束的项目方案。已有工程原型为附件处理、连续追问、稳定映射、完整载荷检查和复核记录提供基础。目标版本通过本地小型大语言模型增强中文语义识别，其实际收益仍由独立实验确认。</w:t>
+        <w:t>隐盾形成了以统一对话为入口、以本地模型为识别和动作决策核心、以程序安全检查为执行约束的项目。识别层已接入微调后的 GLiNER 语义模型，动作层采用 TF-IDF + 逻辑回归，配合附件处理、连续追问、稳定映射、完整载荷检查和复核记录构成可运行原型。</w:t>
       </w:r>
     </w:p>
     <w:p>
@@ -10881,7 +10856,7 @@
           <w:szCs w:val="28"/>
           <w:lang w:eastAsia="zh-CN"/>
         </w:rPr>
-        <w:t>项目当前可支持的结论是：现有统一流程具备可运行原型和可追溯的工程检查，专项识别模型与真实场景效果尚需补证。完成以下记录后，才能将目标架构、实验结论和演示视频一致地归档为最终验收材料。</w:t>
+        <w:t>项目当前可支持的结论是：统一流程具备可运行原型、可追溯的工程检查与已评测的识别模型（独立集 F1 0.907）；真实 API、人工任务评测、多轮一致性验收与第二台电脑部署仍待补。完成以下记录后，才能将实验结论和演示视频一致地归档为最终验收材料。</w:t>
       </w:r>
     </w:p>
     <w:tbl>
@@ -11067,7 +11042,7 @@
                 <w:szCs w:val="28"/>
                 <w:lang w:eastAsia="zh-CN"/>
               </w:rPr>
-              <w:t>学校、成员、教师、分工与联系信息</w:t>
+              <w:t>已定：gliner_multi-v2.1（Apache-2.0），权重本机 D:/project/models/gliner_v3（不在仓库内）；精确 SHA256 待补</w:t>
             </w:r>
           </w:p>
         </w:tc>
@@ -11170,7 +11145,7 @@
                 <w:szCs w:val="28"/>
                 <w:lang w:eastAsia="zh-CN"/>
               </w:rPr>
-              <w:t>实际基座、权重路径、版本、SHA256、许可</w:t>
+              <w:t>已填：本机 RTX 5060 微调约 700 步、字符级分词；完整日志、超参与费用口径仍待补</w:t>
             </w:r>
           </w:p>
         </w:tc>

</xml_diff>